<commit_message>
update: clean up archived lab projects.
</commit_message>
<xml_diff>
--- a/lab11_3_2/Лабораторна робота №11_3_2.docx
+++ b/lab11_3_2/Лабораторна робота №11_3_2.docx
@@ -715,10 +715,10 @@
           <w:szCs w:val="28"/>
         </w:rPr>
         <w:drawing>
-          <wp:inline distT="0" distB="0" distL="0" distR="0" wp14:anchorId="2977B963" wp14:editId="3EBDC48B">
-            <wp:extent cx="5943600" cy="2067560"/>
-            <wp:effectExtent l="0" t="0" r="0" b="8890"/>
-            <wp:docPr id="2" name="Рисунок 2"/>
+          <wp:inline distT="0" distB="0" distL="0" distR="0" wp14:anchorId="0AE170B5" wp14:editId="1A331860">
+            <wp:extent cx="5943600" cy="1604645"/>
+            <wp:effectExtent l="0" t="0" r="0" b="0"/>
+            <wp:docPr id="3" name="Рисунок 3"/>
             <wp:cNvGraphicFramePr>
               <a:graphicFrameLocks xmlns:a="http://schemas.openxmlformats.org/drawingml/2006/main" noChangeAspect="1"/>
             </wp:cNvGraphicFramePr>
@@ -726,7 +726,7 @@
               <a:graphicData uri="http://schemas.openxmlformats.org/drawingml/2006/picture">
                 <pic:pic xmlns:pic="http://schemas.openxmlformats.org/drawingml/2006/picture">
                   <pic:nvPicPr>
-                    <pic:cNvPr id="2" name="Рисунок 2"/>
+                    <pic:cNvPr id="3" name="Рисунок 3"/>
                     <pic:cNvPicPr/>
                   </pic:nvPicPr>
                   <pic:blipFill>
@@ -744,7 +744,7 @@
                   <pic:spPr>
                     <a:xfrm>
                       <a:off x="0" y="0"/>
-                      <a:ext cx="5943600" cy="2067560"/>
+                      <a:ext cx="5943600" cy="1604645"/>
                     </a:xfrm>
                     <a:prstGeom prst="rect">
                       <a:avLst/>
@@ -869,6 +869,25 @@
     </w:p>
     <w:p>
       <w:pPr>
+        <w:rPr>
+          <w:rFonts w:ascii="Times New Roman" w:hAnsi="Times New Roman" w:cs="Times New Roman"/>
+          <w:color w:val="1F1F1F"/>
+          <w:sz w:val="28"/>
+          <w:szCs w:val="28"/>
+        </w:rPr>
+      </w:pPr>
+      <w:r>
+        <w:rPr>
+          <w:rFonts w:ascii="Times New Roman" w:hAnsi="Times New Roman" w:cs="Times New Roman"/>
+          <w:color w:val="1F1F1F"/>
+          <w:sz w:val="28"/>
+          <w:szCs w:val="28"/>
+        </w:rPr>
+        <w:br w:type="page"/>
+      </w:r>
+    </w:p>
+    <w:p>
+      <w:pPr>
         <w:pBdr>
           <w:top w:val="nil"/>
           <w:left w:val="nil"/>
@@ -2336,6 +2355,7 @@
       <w:r>
         <w:rPr>
           <w:rFonts w:ascii="Times New Roman" w:hAnsi="Times New Roman" w:cs="Times New Roman"/>
+          <w:noProof/>
           <w:color w:val="1F1F1F"/>
           <w:sz w:val="28"/>
           <w:szCs w:val="28"/>
@@ -3414,6 +3434,7 @@
   <w:style w:type="character" w:default="1" w:styleId="a0">
     <w:name w:val="Default Paragraph Font"/>
     <w:uiPriority w:val="1"/>
+    <w:semiHidden/>
     <w:unhideWhenUsed/>
   </w:style>
   <w:style w:type="table" w:default="1" w:styleId="a1">

</xml_diff>